<commit_message>
EP05: restyle the optimized resume (was too plain)
Proper name block with target role, accent section rules, bolded headline
metrics, added project section to fill the page; render now crops the A4
whitespace (top 72%). Page beat widened to 880px.

https://claude.ai/code/session_016QPfpNqDtnmHxsSSREnZTn
</commit_message>
<xml_diff>
--- a/lhopital-video/public/aitool/resume/files/after.docx
+++ b/lhopital-video/public/aitool/resume/files/after.docx
@@ -4,37 +4,52 @@
   <w:body>
     <w:p>
       <w:pPr>
-        <w:jc w:val="center"/>
+        <w:spacing w:after="40"/>
+      </w:pPr>
+      <w:r>
+        <w:rPr>
+          <w:b/>
+          <w:color w:val="20262C"/>
+          <w:sz w:val="48"/>
+        </w:rPr>
+        <w:t>张小雅</w:t>
+      </w:r>
+      <w:r>
+        <w:rPr>
+          <w:b/>
+          <w:color w:val="1A5F9E"/>
+          <w:sz w:val="26"/>
+        </w:rPr>
+        <w:t xml:space="preserve">　　高级新媒体运营</w:t>
+      </w:r>
+    </w:p>
+    <w:p>
+      <w:pPr>
+        <w:spacing w:after="160"/>
+        <w:pBdr>
+          <w:bottom w:val="single" w:sz="14" w:space="6" w:color="1A5F9E"/>
+        </w:pBdr>
+      </w:pPr>
+      <w:r>
+        <w:rPr>
+          <w:color w:val="666E76"/>
+          <w:sz w:val="19"/>
+        </w:rPr>
+        <w:t>电话 138-xxxx-xxxx ｜ 邮箱 zhangxy@example.com ｜ 微信 zxy-yunying</w:t>
+      </w:r>
+    </w:p>
+    <w:p>
+      <w:pPr>
+        <w:spacing w:before="260" w:after="100"/>
+        <w:pBdr>
+          <w:bottom w:val="single" w:sz="6" w:space="3" w:color="D8E2EC"/>
+        </w:pBdr>
       </w:pPr>
       <w:r>
         <w:rPr>
           <w:b/>
           <w:color w:val="1A5F9E"/>
-          <w:sz w:val="36"/>
-        </w:rPr>
-        <w:t>张小雅</w:t>
-      </w:r>
-    </w:p>
-    <w:p>
-      <w:pPr>
-        <w:jc w:val="center"/>
-      </w:pPr>
-      <w:r>
-        <w:rPr>
-          <w:sz w:val="19"/>
-        </w:rPr>
-        <w:t>电话 138-xxxx-xxxx ｜ 邮箱 zhangxy@example.com ｜ 求职意向：高级新媒体运营</w:t>
-      </w:r>
-    </w:p>
-    <w:p>
-      <w:pPr>
-        <w:spacing w:before="200" w:after="80"/>
-      </w:pPr>
-      <w:r>
-        <w:rPr>
-          <w:b/>
-          <w:color w:val="1A5F9E"/>
-          <w:sz w:val="26"/>
+          <w:sz w:val="27"/>
         </w:rPr>
         <w:t>核心亮点</w:t>
       </w:r>
@@ -48,37 +63,59 @@
           <w:b w:val="0"/>
           <w:sz w:val="21"/>
         </w:rPr>
-        <w:t>3 年新媒体运营：单号粉丝 1.2万 → 8.6万；6 篇 10w+；12 场活动最高单场拉新 9,400 人。</w:t>
+        <w:t>3 年新媒体运营，擅长用户增长与内容转化：</w:t>
       </w:r>
     </w:p>
     <w:p>
       <w:pPr>
-        <w:spacing w:before="200" w:after="80"/>
+        <w:spacing w:after="60"/>
+        <w:ind w:left="255"/>
+      </w:pPr>
+      <w:r>
+        <w:rPr>
+          <w:b/>
+          <w:sz w:val="21"/>
+        </w:rPr>
+        <w:t>• 单号粉丝 1.2万 → 8.6万（+617%）｜ 6 篇 10w+ ｜ 单场活动拉新 9,400 人</w:t>
+      </w:r>
+    </w:p>
+    <w:p>
+      <w:pPr>
+        <w:spacing w:before="260" w:after="100"/>
+        <w:pBdr>
+          <w:bottom w:val="single" w:sz="6" w:space="3" w:color="D8E2EC"/>
+        </w:pBdr>
       </w:pPr>
       <w:r>
         <w:rPr>
           <w:b/>
           <w:color w:val="1A5F9E"/>
-          <w:sz w:val="26"/>
+          <w:sz w:val="27"/>
         </w:rPr>
         <w:t>工作经历</w:t>
       </w:r>
     </w:p>
     <w:p>
       <w:pPr>
-        <w:spacing w:after="40"/>
+        <w:spacing w:after="20"/>
       </w:pPr>
       <w:r>
         <w:rPr>
           <w:b/>
           <w:sz w:val="21"/>
         </w:rPr>
-        <w:t>某互联网公司 · 新媒体运营专员（2023.06 - 至今）</w:t>
+        <w:t>某互联网公司 · 新媒体运营专员</w:t>
+      </w:r>
+      <w:r>
+        <w:rPr>
+          <w:color w:val="666E76"/>
+        </w:rPr>
+        <w:t xml:space="preserve">　2023.06 - 至今</w:t>
       </w:r>
     </w:p>
     <w:p>
       <w:pPr>
-        <w:spacing w:after="40"/>
+        <w:spacing w:after="60"/>
         <w:ind w:left="255"/>
       </w:pPr>
       <w:r>
@@ -91,7 +128,7 @@
     </w:p>
     <w:p>
       <w:pPr>
-        <w:spacing w:after="40"/>
+        <w:spacing w:after="60"/>
         <w:ind w:left="255"/>
       </w:pPr>
       <w:r>
@@ -104,7 +141,7 @@
     </w:p>
     <w:p>
       <w:pPr>
-        <w:spacing w:after="40"/>
+        <w:spacing w:after="60"/>
         <w:ind w:left="255"/>
       </w:pPr>
       <w:r>
@@ -117,7 +154,7 @@
     </w:p>
     <w:p>
       <w:pPr>
-        <w:spacing w:after="40"/>
+        <w:spacing w:after="60"/>
         <w:ind w:left="255"/>
       </w:pPr>
       <w:r>
@@ -130,57 +167,129 @@
     </w:p>
     <w:p>
       <w:pPr>
-        <w:spacing w:before="200" w:after="80"/>
+        <w:spacing w:before="260" w:after="100"/>
+        <w:pBdr>
+          <w:bottom w:val="single" w:sz="6" w:space="3" w:color="D8E2EC"/>
+        </w:pBdr>
       </w:pPr>
       <w:r>
         <w:rPr>
           <w:b/>
           <w:color w:val="1A5F9E"/>
-          <w:sz w:val="26"/>
+          <w:sz w:val="27"/>
+        </w:rPr>
+        <w:t>项目经历</w:t>
+      </w:r>
+    </w:p>
+    <w:p>
+      <w:pPr>
+        <w:spacing w:after="20"/>
+      </w:pPr>
+      <w:r>
+        <w:rPr>
+          <w:b/>
+          <w:sz w:val="21"/>
+        </w:rPr>
+        <w:t>私域增长项目 · 负责人</w:t>
+      </w:r>
+      <w:r>
+        <w:rPr>
+          <w:color w:val="666E76"/>
+        </w:rPr>
+        <w:t xml:space="preserve">　2024.03 - 2024.09</w:t>
+      </w:r>
+    </w:p>
+    <w:p>
+      <w:pPr>
+        <w:spacing w:after="60"/>
+        <w:ind w:left="255"/>
+      </w:pPr>
+      <w:r>
+        <w:rPr>
+          <w:b w:val="0"/>
+          <w:sz w:val="21"/>
+        </w:rPr>
+        <w:t>• 从 0 搭建企业微信私域，6 个月沉淀用户 2.3万，复购率提升 18%</w:t>
+      </w:r>
+    </w:p>
+    <w:p>
+      <w:pPr>
+        <w:spacing w:after="60"/>
+        <w:ind w:left="255"/>
+      </w:pPr>
+      <w:r>
+        <w:rPr>
+          <w:b w:val="0"/>
+          <w:sz w:val="21"/>
+        </w:rPr>
+        <w:t>• 设计 3 套自动化欢迎/召回流程，人工客服量减少 40%</w:t>
+      </w:r>
+    </w:p>
+    <w:p>
+      <w:pPr>
+        <w:spacing w:before="260" w:after="100"/>
+        <w:pBdr>
+          <w:bottom w:val="single" w:sz="6" w:space="3" w:color="D8E2EC"/>
+        </w:pBdr>
+      </w:pPr>
+      <w:r>
+        <w:rPr>
+          <w:b/>
+          <w:color w:val="1A5F9E"/>
+          <w:sz w:val="27"/>
         </w:rPr>
         <w:t>教育背景</w:t>
       </w:r>
     </w:p>
     <w:p>
       <w:pPr>
-        <w:spacing w:after="40"/>
+        <w:spacing w:after="20"/>
+      </w:pPr>
+      <w:r>
+        <w:rPr>
+          <w:b/>
+          <w:sz w:val="21"/>
+        </w:rPr>
+        <w:t>某大学 · 市场营销 本科</w:t>
+      </w:r>
+      <w:r>
+        <w:rPr>
+          <w:color w:val="666E76"/>
+        </w:rPr>
+        <w:t xml:space="preserve">　2019 - 2023</w:t>
+      </w:r>
+    </w:p>
+    <w:p>
+      <w:pPr>
+        <w:spacing w:before="260" w:after="100"/>
+        <w:pBdr>
+          <w:bottom w:val="single" w:sz="6" w:space="3" w:color="D8E2EC"/>
+        </w:pBdr>
+      </w:pPr>
+      <w:r>
+        <w:rPr>
+          <w:b/>
+          <w:color w:val="1A5F9E"/>
+          <w:sz w:val="27"/>
+        </w:rPr>
+        <w:t>技能</w:t>
+      </w:r>
+    </w:p>
+    <w:p>
+      <w:pPr>
+        <w:spacing w:after="60"/>
       </w:pPr>
       <w:r>
         <w:rPr>
           <w:b w:val="0"/>
           <w:sz w:val="21"/>
         </w:rPr>
-        <w:t>某大学 · 市场营销 本科（2019 - 2023）</w:t>
-      </w:r>
-    </w:p>
-    <w:p>
-      <w:pPr>
-        <w:spacing w:before="200" w:after="80"/>
-      </w:pPr>
-      <w:r>
-        <w:rPr>
-          <w:b/>
-          <w:color w:val="1A5F9E"/>
-          <w:sz w:val="26"/>
-        </w:rPr>
-        <w:t>技能</w:t>
-      </w:r>
-    </w:p>
-    <w:p>
-      <w:pPr>
-        <w:spacing w:after="40"/>
-      </w:pPr>
-      <w:r>
-        <w:rPr>
-          <w:b w:val="0"/>
-          <w:sz w:val="21"/>
-        </w:rPr>
-        <w:t>用户增长 ｜ 活动策划 ｜ 数据分析（Excel/GA）｜ 内容矩阵 ｜ 私域运营</w:t>
+        <w:t>用户增长 ｜ 活动策划 ｜ 数据分析（Excel / GA）｜ 内容矩阵 ｜ 私域运营</w:t>
       </w:r>
     </w:p>
     <w:sectPr>
       <w:pgSz w:w="12240" w:h="15840"/>
-      <w:pgMar w:top="907" w:right="1020" w:bottom="907" w:left="1020" w:header="720" w:footer="720" w:gutter="0"/>
+      <w:pgMar w:top="850" w:right="1077" w:bottom="850" w:left="1077" w:header="720" w:footer="720" w:gutter="0"/>
       <w:cols w:space="720"/>
       <w:docGrid w:linePitch="360"/>
     </w:sectPr>
@@ -552,7 +661,7 @@
     <w:qFormat/>
     <w:rsid w:val="00FC693F"/>
     <w:rPr>
-      <w:rFonts w:ascii="WenQuanYi Zen Hei" w:hAnsi="WenQuanYi Zen Hei"/>
+      <w:rFonts w:ascii="WenQuanYi Zen Hei" w:hAnsi="WenQuanYi Zen Hei" w:eastAsia="WenQuanYi Zen Hei"/>
       <w:sz w:val="21"/>
     </w:rPr>
   </w:style>

</xml_diff>